<commit_message>
Exports : sommaire cliquable dans le PDF/Word/site, archive zip pret a envoyer
</commit_message>
<xml_diff>
--- a/export/Chien-citoyen-de-Paris-version-grand-public.docx
+++ b/export/Chien-citoyen-de-Paris-version-grand-public.docx
@@ -34,6 +34,264 @@
       </w:pPr>
       <w:r>
         <w:t>Le chien citoyen de Paris — version grand public</w:t>
+      </w:r>
+    </w:p>
+    <w:p>
+      <w:pPr>
+        <w:pStyle w:val="Heading2"/>
+      </w:pPr>
+      <w:r>
+        <w:t>Sommaire</w:t>
+      </w:r>
+    </w:p>
+    <w:p>
+      <w:pPr>
+        <w:pStyle w:val="ListBullet"/>
+      </w:pPr>
+      <w:r>
+        <w:rPr>
+          <w:b w:val="0"/>
+        </w:rPr>
+        <w:t>Le problème, tel qu'on le vit</w:t>
+      </w:r>
+    </w:p>
+    <w:p>
+      <w:pPr>
+        <w:pStyle w:val="ListBullet"/>
+      </w:pPr>
+      <w:r>
+        <w:rPr>
+          <w:b w:val="0"/>
+        </w:rPr>
+        <w:t>L'idée</w:t>
+      </w:r>
+    </w:p>
+    <w:p>
+      <w:pPr>
+        <w:pStyle w:val="ListBullet"/>
+      </w:pPr>
+      <w:r>
+        <w:rPr>
+          <w:b w:val="0"/>
+        </w:rPr>
+        <w:t>Ce que vous auriez à faire, concrètement</w:t>
+      </w:r>
+    </w:p>
+    <w:p>
+      <w:pPr>
+        <w:pStyle w:val="ListBullet"/>
+      </w:pPr>
+      <w:r>
+        <w:rPr>
+          <w:b w:val="0"/>
+        </w:rPr>
+        <w:t>Ce que votre chien y gagnerait</w:t>
+      </w:r>
+    </w:p>
+    <w:p>
+      <w:pPr>
+        <w:pStyle w:val="ListBullet"/>
+      </w:pPr>
+      <w:r>
+        <w:rPr>
+          <w:b w:val="0"/>
+        </w:rPr>
+        <w:t>Combien ça vous coûte</w:t>
+      </w:r>
+    </w:p>
+    <w:p>
+      <w:pPr>
+        <w:pStyle w:val="ListBullet"/>
+      </w:pPr>
+      <w:r>
+        <w:rPr>
+          <w:b w:val="0"/>
+        </w:rPr>
+        <w:t>Et si on ne s'inscrit pas</w:t>
+      </w:r>
+    </w:p>
+    <w:p>
+      <w:pPr>
+        <w:pStyle w:val="ListBullet"/>
+      </w:pPr>
+      <w:r>
+        <w:rPr>
+          <w:b w:val="0"/>
+        </w:rPr>
+        <w:t>Ce que devient l'ADN de votre chien</w:t>
+      </w:r>
+    </w:p>
+    <w:p>
+      <w:pPr>
+        <w:pStyle w:val="ListBullet"/>
+      </w:pPr>
+      <w:r>
+        <w:rPr>
+          <w:b w:val="0"/>
+        </w:rPr>
+        <w:t>Ce qui n'est pas réglé</w:t>
+      </w:r>
+    </w:p>
+    <w:p>
+      <w:pPr>
+        <w:pStyle w:val="ListBullet"/>
+      </w:pPr>
+      <w:r>
+        <w:rPr>
+          <w:b w:val="0"/>
+        </w:rPr>
+        <w:t>Comment vous pouvez y prendre part</w:t>
+      </w:r>
+    </w:p>
+    <w:p>
+      <w:r>
+        <w:rPr>
+          <w:b/>
+        </w:rPr>
+        <w:t>Le statut du chien citoyen de Paris</w:t>
+      </w:r>
+    </w:p>
+    <w:p>
+      <w:pPr>
+        <w:pStyle w:val="ListBullet"/>
+      </w:pPr>
+      <w:r>
+        <w:rPr>
+          <w:b w:val="0"/>
+        </w:rPr>
+        <w:t>Le résumé</w:t>
+      </w:r>
+    </w:p>
+    <w:p>
+      <w:pPr>
+        <w:pStyle w:val="ListBullet"/>
+      </w:pPr>
+      <w:r>
+        <w:rPr>
+          <w:b w:val="0"/>
+        </w:rPr>
+        <w:t>Le problème, en chiffres</w:t>
+      </w:r>
+    </w:p>
+    <w:p>
+      <w:pPr>
+        <w:pStyle w:val="ListBullet"/>
+      </w:pPr>
+      <w:r>
+        <w:rPr>
+          <w:b w:val="0"/>
+        </w:rPr>
+        <w:t>Pourquoi le sujet est libre</w:t>
+      </w:r>
+    </w:p>
+    <w:p>
+      <w:pPr>
+        <w:pStyle w:val="ListBullet"/>
+      </w:pPr>
+      <w:r>
+        <w:rPr>
+          <w:b w:val="0"/>
+        </w:rPr>
+        <w:t>Le dispositif</w:t>
+      </w:r>
+    </w:p>
+    <w:p>
+      <w:pPr>
+        <w:pStyle w:val="ListBullet"/>
+      </w:pPr>
+      <w:r>
+        <w:rPr>
+          <w:b w:val="0"/>
+        </w:rPr>
+        <w:t>Ce qui a déjà été essayé</w:t>
+      </w:r>
+    </w:p>
+    <w:p>
+      <w:pPr>
+        <w:pStyle w:val="ListBullet"/>
+      </w:pPr>
+      <w:r>
+        <w:rPr>
+          <w:b w:val="0"/>
+        </w:rPr>
+        <w:t>Ce que ça coûte</w:t>
+      </w:r>
+    </w:p>
+    <w:p>
+      <w:pPr>
+        <w:pStyle w:val="ListBullet"/>
+      </w:pPr>
+      <w:r>
+        <w:rPr>
+          <w:b w:val="0"/>
+        </w:rPr>
+        <w:t>Ce que ça rapporte</w:t>
+      </w:r>
+    </w:p>
+    <w:p>
+      <w:pPr>
+        <w:pStyle w:val="ListBullet"/>
+      </w:pPr>
+      <w:r>
+        <w:rPr>
+          <w:b w:val="0"/>
+        </w:rPr>
+        <w:t>Qui peut le porter</w:t>
+      </w:r>
+    </w:p>
+    <w:p>
+      <w:pPr>
+        <w:pStyle w:val="ListBullet"/>
+      </w:pPr>
+      <w:r>
+        <w:rPr>
+          <w:b w:val="0"/>
+        </w:rPr>
+        <w:t>Les objections, et ce que j'y réponds</w:t>
+      </w:r>
+    </w:p>
+    <w:p>
+      <w:pPr>
+        <w:pStyle w:val="ListBullet"/>
+      </w:pPr>
+      <w:r>
+        <w:rPr>
+          <w:b w:val="0"/>
+        </w:rPr>
+        <w:t>Les cinq décisions qui restent</w:t>
+      </w:r>
+    </w:p>
+    <w:p>
+      <w:pPr>
+        <w:pStyle w:val="ListBullet"/>
+      </w:pPr>
+      <w:r>
+        <w:rPr>
+          <w:b w:val="0"/>
+        </w:rPr>
+        <w:t>Les prochaines étapes</w:t>
+      </w:r>
+    </w:p>
+    <w:p>
+      <w:pPr>
+        <w:pStyle w:val="ListBullet"/>
+      </w:pPr>
+      <w:r>
+        <w:rPr>
+          <w:b w:val="0"/>
+        </w:rPr>
+        <w:t>Où lire le détail</w:t>
+      </w:r>
+    </w:p>
+    <w:p>
+      <w:pPr>
+        <w:pStyle w:val="ListBullet"/>
+      </w:pPr>
+      <w:r>
+        <w:rPr>
+          <w:b w:val="0"/>
+        </w:rPr>
+        <w:t>Sources</w:t>
       </w:r>
     </w:p>
     <w:p>

</xml_diff>